<commit_message>
Humanizar redacción del capítulo 1 manteniendo la extensión
Co-Authored-By: Claude Opus 5.5 <noreply@anthropic.com>
Claude-Session: https://claude.ai/code/session_01GAnGPTvU3wixsZdV3Y7S1e
</commit_message>
<xml_diff>
--- a/TESIS · CAP 1 · KLM (reescrito).docx
+++ b/TESIS · CAP 1 · KLM (reescrito).docx
@@ -8263,7 +8263,7 @@
           <w:sz w:val="24"/>
           <w:szCs w:val="24"/>
         </w:rPr>
-        <w:t xml:space="preserve">En este primer capítulo se presenta el tema de la investigación y las razones por las que se eligió. Primero se revisan los antecedentes, es decir, cómo ha cambiado la relación entre las personas y los animales de compañía en México y qué pasa hoy en Nuevo León y en Guadalupe. Después se explica por qué vale la pena desarrollar este proyecto, cuáles son los problemas principales que se detectaron y, al final, qué objetivos se quieren alcanzar.</w:t>
+        <w:t xml:space="preserve">En este primer capítulo se presenta el tema de la investigación y el motivo por el que se eligió. Se empieza con los antecedentes, o sea, cómo ha cambiado la relación entre las personas y sus animales de compañía en México y qué está pasando hoy en Nuevo León y en Guadalupe. Luego se explica por qué vale la pena hacer este proyecto, cuáles son los problemas que se encontraron durante la investigación y qué objetivos se quieren alcanzar.</w:t>
       </w:r>
     </w:p>
     <w:p>
@@ -8282,7 +8282,7 @@
           <w:sz w:val="24"/>
           <w:szCs w:val="24"/>
         </w:rPr>
-        <w:t xml:space="preserve">La idea general del proyecto es diseñar un Centro de Bienestar Animal y Cultural en el municipio de Guadalupe, Nuevo León. Se trata de un refugio para perros y gatos que viven en la calle, pero que además tenga espacios abiertos a la comunidad, como talleres, áreas de convivencia, zonas de recorrido y actividades culturales. A este tipo de proyecto se le llama refugio híbrido, porque junta en un mismo lugar funciones que normalmente están separadas.</w:t>
+        <w:t xml:space="preserve">La propuesta es un Centro de Bienestar Animal y Cultural en el municipio de Guadalupe, Nuevo León. Funcionaría como refugio para perros y gatos en situación de calle, pero también estaría abierto a la comunidad, con talleres, zonas de convivencia, recorridos y actividades culturales. Como junta en un solo lugar funciones que normalmente se manejan por separado, a este tipo de proyecto se le llama refugio híbrido.</w:t>
       </w:r>
     </w:p>
     <w:p>
@@ -8340,7 +8340,7 @@
           <w:sz w:val="24"/>
           <w:szCs w:val="24"/>
         </w:rPr>
-        <w:t xml:space="preserve">En México, la forma en que las familias ven a sus mascotas ha cambiado bastante en los últimos años. Antes era común que un perro viviera en el patio y cumpliera una función, como cuidar la casa. Hoy muchas personas lo consideran un miembro más de la familia, con su propio espacio dentro del hogar, sus visitas al veterinario y sus gastos mensuales.</w:t>
+        <w:t xml:space="preserve">La manera en que las familias mexicanas ven a sus mascotas ha cambiado bastante. Hace algunos años lo normal era que el perro viviera en el patio y su trabajo fuera cuidar la casa. Ahora muchas personas lo tratan como a un integrante más de la familia: duerme adentro, tiene su veterinario de confianza y hasta un gasto fijo cada mes. Basta con ver cuántas tiendas de mascotas, estéticas caninas y cafeterías que aceptan perros han abierto en Monterrey en los últimos años para darse cuenta de que el tema ya es parte de la vida cotidiana.</w:t>
       </w:r>
     </w:p>
     <w:p>
@@ -8359,7 +8359,7 @@
           <w:sz w:val="24"/>
           <w:szCs w:val="24"/>
         </w:rPr>
-        <w:t xml:space="preserve">Los datos oficiales confirman este cambio. Según la Encuesta Nacional de Bienestar Autorreportado (ENBIARE) 2021 del Instituto Nacional de Estadística y Geografía, el 69.8 % de los hogares del país tiene al menos una mascota. En total se calculan cerca de 80 millones de animales de compañía: 43.8 millones de perros, 16.2 millones de gatos y alrededor de 20 millones de otras especies (INEGI, 2021). Para darnos una idea, eso quiere decir que en siete de cada diez casas mexicanas vive por lo menos un animal.</w:t>
+        <w:t xml:space="preserve">Los números oficiales lo confirman. La Encuesta Nacional de Bienestar Autorreportado (ENBIARE) 2021 del INEGI encontró que el 69.8 % de los hogares del país tiene al menos una mascota, y calcula que en total hay cerca de 80 millones de animales de compañía. De ellos, 43.8 millones son perros, 16.2 millones son gatos y alrededor de 20 millones pertenecen a otras especies (INEGI, 2021). Dicho de forma más sencilla, en siete de cada diez casas vive por lo menos un animal.</w:t>
       </w:r>
     </w:p>
     <w:p>
@@ -8378,7 +8378,7 @@
           <w:sz w:val="24"/>
           <w:szCs w:val="24"/>
         </w:rPr>
-        <w:t xml:space="preserve">Con estos números se entiende que los animales ya son parte de la vida diaria de las ciudades. Caminan por las banquetas, van a los parques, viajan en coche con sus dueños y, en muchos casos, también terminan en la calle. Por eso, cuando se planea una ciudad o se diseña un edificio público, tendría sentido tomarlos en cuenta como usuarios del espacio, igual que se toma en cuenta a los niños, a los adultos mayores o a las personas con discapacidad.</w:t>
+        <w:t xml:space="preserve">Con cifras así queda claro que los animales forman parte de la vida diaria de la ciudad. Caminan por las banquetas, los llevan al parque, viajan en el coche con sus dueños y, en muchos casos, también terminan viviendo en la calle. Si cuando se diseña un espacio público se piensa en los niños, en los adultos mayores y en las personas con discapacidad, tiene sentido pensar también en los animales que lo van a usar.</w:t>
       </w:r>
     </w:p>
     <w:p>
@@ -8397,7 +8397,7 @@
           <w:sz w:val="24"/>
           <w:szCs w:val="24"/>
         </w:rPr>
-        <w:t xml:space="preserve">El problema es que el crecimiento de las ciudades no siempre va acompañado de espacios para atender a los animales. Cuando una familia se muda, cuando un cachorro crece más de lo que esperaban o cuando no hay dinero para cuidarlo, muchas veces el animal termina abandonado. Si además no está esterilizado, se reproduce en la calle y el número de perros y gatos sin hogar va aumentando año con año.</w:t>
+        <w:t xml:space="preserve">El problema aparece cuando la ciudad crece más rápido que los servicios para atenderlos. Una familia se cambia de casa y no se lleva al perro. Un cachorro crece más de lo que esperaban. No alcanza el dinero para la comida o el veterinario. En cualquiera de estos casos, lo más común es que el animal termine abandonado, y si no está esterilizado se reproduce en la calle, así que cada año hay más perros y gatos sin hogar.</w:t>
       </w:r>
     </w:p>
     <w:p>
@@ -8416,7 +8416,7 @@
           <w:sz w:val="24"/>
           <w:szCs w:val="24"/>
         </w:rPr>
-        <w:t xml:space="preserve">En Nuevo León existe la Ley de Protección y Bienestar Animal para la Sustentabilidad del Estado, que tuvo su última reforma en 2025. En su artículo 1, esta ley señala que los municipios son los principales responsables de dar alojamiento a los animales, cuidar su salud y evitar que sufran maltrato o crueldad. En otras palabras, tener espacios para atender a los animales, además de ser una necesidad social, es una obligación que marca la ley para cada municipio.</w:t>
+        <w:t xml:space="preserve">Nuevo León cuenta con la Ley de Protección y Bienestar Animal para la Sustentabilidad del Estado, reformada por última vez en 2025. Su artículo 1 señala que los municipios son los principales responsables de dar alojamiento a los animales, cuidar su salud y evitar que sufran maltrato o crueldad. Tener un lugar para atenderlos, entonces, no depende solo de la buena voluntad de la gente; la ley se lo pide a cada municipio.</w:t>
       </w:r>
     </w:p>
     <w:p>
@@ -8435,7 +8435,7 @@
           <w:sz w:val="24"/>
           <w:szCs w:val="24"/>
         </w:rPr>
-        <w:t xml:space="preserve">En la práctica, no todos los municipios cumplen con esta obligación. De acuerdo con reportes estatales, en 2025 solo 27 de los 51 municipios de Nuevo León tenían un centro de atención animal funcionando [agregar fuente]. Eso significa que casi la mitad de los municipios no tiene un lugar a donde llevar a un animal rescatado, herido o abandonado.</w:t>
+        <w:t xml:space="preserve">Aun así, no todos cumplen. Según reportes estatales, en 2025 solo 27 de los 51 municipios de Nuevo León tenían un centro de atención animal funcionando [agregar fuente]. Eso quiere decir que en casi la mitad de los municipios no hay a dónde llevar a un animal rescatado, herido o abandonado.</w:t>
       </w:r>
     </w:p>
     <w:p>
@@ -8454,7 +8454,7 @@
           <w:sz w:val="24"/>
           <w:szCs w:val="24"/>
         </w:rPr>
-        <w:t xml:space="preserve">Esta situación se vuelve más complicada en el área metropolitana de Monterrey, donde viven más de 5.3 millones de personas según el Censo de Población y Vivienda 2020 (INEGI, 2021). En una zona tan poblada, la cantidad de animales también es alta, y los pocos centros de atención que existen no alcanzan para cubrir la demanda. El resultado se ve todos los días en las colonias: perros que duermen en camellones, gatos en lotes baldíos, reportes de mordeduras y vecinos que no saben a quién llamar.</w:t>
+        <w:t xml:space="preserve">En el área metropolitana de Monterrey la situación se complica todavía más, porque ahí viven más de 5.3 millones de personas de acuerdo con el Censo de Población y Vivienda 2020 (INEGI, 2021). Con tanta gente también hay muchos animales, y los pocos centros de atención que existen no se dan abasto. Basta con recorrer algunas colonias para verlo: perros durmiendo en los camellones, gatos en los lotes baldíos, reportes de mordeduras y vecinos que no saben a quién llamar.</w:t>
       </w:r>
     </w:p>
     <w:p>
@@ -8473,7 +8473,7 @@
           <w:sz w:val="24"/>
           <w:szCs w:val="24"/>
         </w:rPr>
-        <w:t xml:space="preserve">Guadalupe es uno de los municipios donde este problema se nota más. Es el tercer municipio más poblado del estado, con 643,143 habitantes en 2020 (INEGI, 2021), y es prácticamente una ciudad consolidada, es decir, casi todo su territorio ya está construido. La mancha urbana ha crecido sobre los cerros y a lo largo del río La Silla, y quedan pocos terrenos libres para equipamiento público, como escuelas, clínicas o parques. Esto hace que sea difícil encontrar un espacio para un refugio tradicional, que normalmente necesita un terreno grande y alejado de las casas.</w:t>
+        <w:t xml:space="preserve">Guadalupe es uno de los municipios donde más se nota. Con 643,143 habitantes en 2020 (INEGI, 2021) es el tercer municipio más poblado del estado, y casi todo su territorio ya está construido. La mancha urbana subió por los cerros y se extendió a lo largo del río La Silla, así que quedan muy pocos terrenos libres para equipamiento público como escuelas, clínicas o parques. Encontrar espacio para un refugio tradicional, que suele necesitar un terreno grande y lejos de las casas, se vuelve muy difícil.</w:t>
       </w:r>
     </w:p>
     <w:p>
@@ -8492,7 +8492,7 @@
           <w:sz w:val="24"/>
           <w:szCs w:val="24"/>
         </w:rPr>
-        <w:t xml:space="preserve">Por eso hace falta pensar en otro tipo de solución. En lugar de un refugio escondido en la periferia, este proyecto propone un lugar que se integre a la ciudad, que la gente pueda visitar y que tenga una razón para ser conocido. La propuesta es un refugio híbrido: un centro de bienestar animal que también funcione como espacio cultural y turístico. Así, además de atender a los animales, se acerca a la gente para que conozca el tema, adopte de forma responsable y participe en actividades que ayuden a mantener el lugar económicamente.</w:t>
+        <w:t xml:space="preserve">Ante esto hace falta otro tipo de solución. En vez de un refugio escondido en la periferia, este proyecto plantea un lugar integrado a la ciudad, que la gente quiera visitar y que tenga motivos para ser conocido. La idea es un refugio híbrido, un centro de bienestar animal que al mismo tiempo sea un espacio cultural y turístico. Así se atiende a los animales y, de paso, se acerca a las personas para que conozcan el tema, adopten con responsabilidad y participen en actividades que ayuden a mantener el lugar.</w:t>
       </w:r>
     </w:p>
     <w:p>
@@ -8550,7 +8550,7 @@
           <w:sz w:val="24"/>
           <w:szCs w:val="24"/>
         </w:rPr>
-        <w:t xml:space="preserve">Justificar un proyecto significa explicar por qué es necesario y qué aporta. En este caso, la propuesta se apoya en tres razones principales: el bienestar de los animales, la forma en que estos espacios se pueden mantener económicamente y las necesidades propias del municipio de Guadalupe. Cada una se explica a continuación.</w:t>
+        <w:t xml:space="preserve">Este proyecto se sostiene en tres razones: el bienestar de los animales, la manera en que un refugio puede mantenerse económicamente y las necesidades concretas del municipio de Guadalupe. A continuación se explica cada una.</w:t>
       </w:r>
     </w:p>
     <w:p>
@@ -8569,7 +8569,7 @@
           <w:sz w:val="24"/>
           <w:szCs w:val="24"/>
         </w:rPr>
-        <w:t xml:space="preserve">La primera razón tiene que ver con el bienestar animal. En la arquitectura y en la planeación de las ciudades casi no se toma en cuenta a los animales domésticos como usuarios. Cuando se diseña un parque, por ejemplo, rara vez se piensa en bebederos para perros, en sombra para ellos o en zonas donde puedan correr sin molestar a otras personas. Lo mismo pasa con los refugios: muchas veces se construyen como bodegas con jaulas, sin pensar en la ventilación, en el ruido o en la luz natural que necesita un animal para estar tranquilo.</w:t>
+        <w:t xml:space="preserve">La primera razón es el bienestar animal. En arquitectura y en planeación urbana casi nunca se considera a los animales domésticos como usuarios. Cuando se diseña un parque, pocas veces se piensa en bebederos para perros, en sombra para ellos o en un área donde puedan correr sin molestar a nadie. Con los refugios pasa algo parecido, porque muchas veces se construyen como bodegas llenas de jaulas, sin cuidar la ventilación, el ruido o la luz natural que un animal necesita para estar tranquilo.</w:t>
       </w:r>
     </w:p>
     <w:p>
@@ -8588,7 +8588,7 @@
           <w:sz w:val="24"/>
           <w:szCs w:val="24"/>
         </w:rPr>
-        <w:t xml:space="preserve">Esto afecta la calidad de vida de los animales y también a las personas que conviven con ellos. Tüzen y Aycı (2023) explican que los espacios pensados para las personas también deberían considerar a los animales, porque dejarlos fuera es ignorar una parte de la sustentabilidad. Un ejemplo sencillo: un perro que pasa el día encerrado en un espacio caluroso y con mucho ruido se estresa, ladra más, se vuelve más difícil de manejar y, por lo mismo, tiene menos posibilidades de ser adoptado. Un buen diseño puede ayudar a evitar ese círculo.</w:t>
+        <w:t xml:space="preserve">Esa falta de atención afecta a los animales y también a quienes conviven con ellos. Tüzen y Aycı (2023) explican que los espacios pensados para las personas deberían considerar también a los animales, porque dejarlos fuera es ignorar una parte de la sustentabilidad. Un caso muy común ayuda a entenderlo: un perro que pasa todo el día encerrado en un lugar caluroso y ruidoso se estresa, ladra más y se vuelve difícil de manejar. Las familias que llegan a adoptar suelen elegir a los animales más tranquilos, así que ese perro se queda más tiempo en el refugio, y mientras más tiempo pasa ahí, más se estresa.</w:t>
       </w:r>
     </w:p>
     <w:p>
@@ -8607,7 +8607,7 @@
           <w:sz w:val="24"/>
           <w:szCs w:val="24"/>
         </w:rPr>
-        <w:t xml:space="preserve">En el área del bienestar animal existe un principio muy conocido llamado las Cinco Libertades, propuesto por el Farm Animal Welfare Council (1979). Dice que todo animal bajo cuidado humano debe estar libre de hambre y sed, libre de incomodidad, libre de dolor y enfermedad, libre de miedo y angustia, y libre para comportarse de forma natural. Varias de estas libertades dependen directamente del espacio. La incomodidad, por ejemplo, tiene que ver con la temperatura y el tipo de piso, y el miedo tiene mucho que ver con el ruido y con la cercanía de otros animales. Por eso la arquitectura sí puede hacer una diferencia en el bienestar de un refugio.</w:t>
+        <w:t xml:space="preserve">Dentro del bienestar animal hay un principio muy conocido, las Cinco Libertades, propuesto por el Farm Animal Welfare Council (1979). Según este principio, todo animal bajo cuidado humano debe estar libre de hambre y sed, de incomodidad, de dolor y enfermedad, y de miedo y angustia, y además debe poder comportarse de forma natural. Varias de estas libertades dependen directamente del espacio. La incomodidad tiene mucho que ver con la temperatura y con el tipo de piso; el miedo, con el ruido y con qué tan cerca están otros animales. En otras palabras, el diseño de un refugio sí influye en cómo viven los animales que están ahí.</w:t>
       </w:r>
     </w:p>
     <w:p>
@@ -8626,7 +8626,7 @@
           <w:sz w:val="24"/>
           <w:szCs w:val="24"/>
         </w:rPr>
-        <w:t xml:space="preserve">La segunda razón es económica. En México la mayoría de los refugios se mantienen con donaciones, voluntarios y, en algunos casos, apoyos del municipio. Estas ayudas son muy valiosas, pero no son estables. Hay meses en los que llegan muchas donaciones y otros en los que casi no llega nada, y cuando eso pasa los refugios tienen que dejar de recibir animales o incluso cerrar.</w:t>
+        <w:t xml:space="preserve">La segunda razón es económica. En México casi todos los refugios dependen de donaciones, de voluntarios y, a veces, de algún apoyo del municipio. Son ayudas muy valiosas, pero no son constantes: hay meses con muchas donaciones y otros en los que casi no llega nada. Cuando eso pasa, el refugio tiene que dejar de recibir animales y, en el peor de los casos, cerrar. A esto se suma que casi todo el dinero se va en comida y medicinas, así que pocas veces sobra algo para mejorar las instalaciones, y muchos refugios pasan años funcionando en los mismos espacios improvisados.</w:t>
       </w:r>
     </w:p>
     <w:p>
@@ -8645,7 +8645,7 @@
           <w:sz w:val="24"/>
           <w:szCs w:val="24"/>
         </w:rPr>
-        <w:t xml:space="preserve">Si el refugio incluye actividades turísticas y culturales, como talleres para niños, recorridos guiados, eventos de adopción, una cafetería o una tienda, puede generar ingresos propios y depender menos de las donaciones. La intención es aprovechar el interés que ya existe en la gente por convivir con los animales, sin convertirlos en una atracción. Muchas familias buscan lugares a donde ir el fin de semana, y si ese lugar además ayuda a los animales, tiene un valor extra para la comunidad.</w:t>
+        <w:t xml:space="preserve">Si el refugio tiene actividades turísticas y culturales, como talleres para niños, recorridos guiados, eventos de adopción, una cafetería o una tienda, puede generar su propio dinero y depender menos de las donaciones. La intención es aprovechar el interés que la gente ya tiene por convivir con los animales, cuidando que ellos no se conviertan en una atracción. Muchas familias buscan a dónde ir el fin de semana, y un lugar que además ayuda a los animales tiene un valor extra para la comunidad.</w:t>
       </w:r>
     </w:p>
     <w:p>
@@ -8664,7 +8664,7 @@
           <w:sz w:val="24"/>
           <w:szCs w:val="24"/>
         </w:rPr>
-        <w:t xml:space="preserve">La tercera razón es el contexto del municipio. En la zona metropolitana de Monterrey, y en especial en Guadalupe, faltan espacios dedicados al bienestar animal, pero también faltan espacios culturales y recreativos, aunque la población sigue siendo muy grande. La ley estatal pide que cada municipio tenga un centro de atención canina y felina, pero no todos lo tienen, y varios de los que existen no están bien equipados ni tienen un enfoque integral. Esto se traduce en sobrepoblación de animales, abandono, problemas entre vecinos y espacios públicos que no se aprovechan.</w:t>
+        <w:t xml:space="preserve">La tercera razón es el propio municipio. En la zona metropolitana de Monterrey, y en particular en Guadalupe, hacen falta espacios para el bienestar animal, pero también faltan espacios culturales y recreativos, a pesar de que la población es muy grande. La ley estatal pide que cada municipio tenga un centro de atención canina y felina y no todos lo tienen. De los que existen, varios no están bien equipados ni tienen un enfoque integral, y esto termina en sobrepoblación de animales, abandono, problemas entre vecinos y espacios públicos desaprovechados.</w:t>
       </w:r>
     </w:p>
     <w:p>
@@ -8683,7 +8683,7 @@
           <w:sz w:val="24"/>
           <w:szCs w:val="24"/>
         </w:rPr>
-        <w:t xml:space="preserve">Además, Guadalupe tiene elementos que pueden ser una oportunidad. Está al lado de Monterrey, tiene buenas vías de comunicación y cuenta con el corredor natural del río La Silla, que atraviesa el municipio y que podría aprovecharse para actividades al aire libre y de educación ambiental. Un proyecto de este tipo podría ayudar a darle una nueva cara a zonas que hoy se ven descuidadas.</w:t>
+        <w:t xml:space="preserve">Guadalupe también tiene cosas a su favor. Colinda con Monterrey, tiene buenas vías de comunicación y lo atraviesa el río La Silla, un corredor natural que se podría aprovechar para actividades al aire libre y de educación ambiental. Un proyecto de este tipo podría ayudar a mejorar zonas que hoy se ven descuidadas.</w:t>
       </w:r>
     </w:p>
     <w:p>
@@ -8702,7 +8702,7 @@
           <w:sz w:val="24"/>
           <w:szCs w:val="24"/>
         </w:rPr>
-        <w:t xml:space="preserve">Por estas razones, un Centro de Bienestar Animal y Cultural en Guadalupe podría atender una carencia real del municipio y, al mismo tiempo, servir como ejemplo para otras ciudades con problemas parecidos. Desde el punto de vista académico, esta investigación también busca aportar una forma diferente de pensar los refugios, donde el diseño arquitectónico se toma en cuenta desde el principio y no solo como un contenedor para las jaulas.</w:t>
+        <w:t xml:space="preserve">Tomando en cuenta estas tres razones, un Centro de Bienestar Animal y Cultural en Guadalupe respondería a una carencia real del municipio y podría servir de ejemplo para otras ciudades con problemas parecidos. En lo académico, la investigación busca proponer otra manera de pensar los refugios, en la que el diseño arquitectónico se considera desde el inicio y no se reduce a acomodar jaulas en un terreno.</w:t>
       </w:r>
     </w:p>
     <w:p>
@@ -8760,7 +8760,7 @@
           <w:sz w:val="24"/>
           <w:szCs w:val="24"/>
         </w:rPr>
-        <w:t xml:space="preserve">Plantear la problemática es describir con claridad qué es lo que está mal y por qué hace falta intervenir. En el caso de Guadalupe, se detectaron tres problemas que están relacionados entre sí. El primero es que hay muchos animales domésticos viviendo en la calle. El segundo es que no hay suficiente infraestructura pública para atenderlos. El tercero es que los refugios que existen siguen un modelo tradicional, que depende de donaciones y casi no se relaciona con la comunidad.</w:t>
+        <w:t xml:space="preserve">En Guadalupe se encontraron tres problemas que están conectados entre sí. Hay muchos animales domésticos viviendo en la calle, no existe suficiente infraestructura pública para atenderlos, y los refugios que hay siguen un modelo tradicional que depende de donaciones y casi no tiene relación con la comunidad.</w:t>
       </w:r>
     </w:p>
     <w:p>
@@ -8779,7 +8779,7 @@
           <w:sz w:val="24"/>
           <w:szCs w:val="24"/>
         </w:rPr>
-        <w:t xml:space="preserve">Estos tres problemas funcionan como una cadena. Si hay más animales en la calle, los refugios se llenan. Si los refugios están llenos y no tienen recursos, no pueden recibir a más animales ni darles una buena atención. Y si los refugios no se relacionan con la gente, casi nadie los visita, adopta o dona, así que siguen sin recursos. Por eso no basta con atender uno solo de los problemas; es necesario verlos en conjunto.</w:t>
+        <w:t xml:space="preserve">Los tres se alimentan uno al otro. Mientras más animales hay en la calle, más rápido se llenan los refugios. Un refugio lleno y sin recursos no puede recibir a más animales ni darles buena atención. Y si nadie lo conoce, casi nadie lo visita, adopta o dona, así que sigue sin recursos. Atender solo uno de estos problemas no alcanza; hay que verlos juntos para entender qué tipo de proyecto se necesita.</w:t>
       </w:r>
     </w:p>
     <w:p>
@@ -8837,7 +8837,7 @@
           <w:sz w:val="24"/>
           <w:szCs w:val="24"/>
         </w:rPr>
-        <w:t xml:space="preserve">La palabra proliferación se refiere a que algo se multiplica rápido. En este caso, se usa para describir cómo el número de perros y gatos en la calle crece cada año. Guadalupe es un municipio con mucha población, con colonias que siguen creciendo y con mucho movimiento de personas, y en este contexto muchos animales terminan en la calle porque sus dueños los abandonan, se mudan y no se los llevan, o no los cuidan de forma responsable.</w:t>
+        <w:t xml:space="preserve">Se habla de proliferación cuando algo se multiplica rápido, y eso es justo lo que pasa con los perros y gatos en la calle. Guadalupe tiene mucha población, colonias que siguen creciendo y mucho movimiento de personas. En ese contexto, muchos animales acaban en la calle porque sus dueños los abandonan, se mudan sin ellos o simplemente no los cuidan.</w:t>
       </w:r>
     </w:p>
     <w:p>
@@ -8856,7 +8856,7 @@
           <w:sz w:val="24"/>
           <w:szCs w:val="24"/>
         </w:rPr>
-        <w:t xml:space="preserve">Un animal que no está esterilizado puede reproducirse muy rápido. Una perra puede tener hasta dos camadas al año, y cada camada puede ser de varios cachorros. Si esos cachorros nacen en la calle y tampoco se esterilizan, en pocos años una sola perra abandonada puede dar origen a decenas de animales sin hogar. Por eso las campañas de esterilización son tan importantes, y por eso también es importante que existan lugares donde se puedan realizar.</w:t>
+        <w:t xml:space="preserve">Un animal sin esterilizar se reproduce muy rápido. Una perra puede tener hasta dos camadas al año, con varios cachorros en cada una. Si esos cachorros nacen en la calle y nadie los esteriliza, en pocos años una sola perra abandonada puede dar origen a decenas de animales sin hogar. Las campañas de esterilización son muy importantes, pero necesitan lugares equipados donde puedan hacerse. Cuando no existe un lugar fijo, estas campañas se organizan en carpas o en espacios prestados, con poco tiempo y una capacidad muy limitada.</w:t>
       </w:r>
     </w:p>
     <w:p>
@@ -8875,7 +8875,7 @@
           <w:sz w:val="24"/>
           <w:szCs w:val="24"/>
         </w:rPr>
-        <w:t xml:space="preserve">Esto termina afectando a toda la comunidad. Los animales en la calle pueden transmitir enfermedades a las personas, que se conocen como enfermedades zoonóticas, por ejemplo la sarna, algunos parásitos intestinales o la leptospirosis. En el caso de la rabia, México logró en 2019 que la Organización Mundial de la Salud reconociera la eliminación de la rabia humana transmitida por perros, pero para mantener ese logro es necesario seguir vacunando y controlando a la población animal. Además de la salud, los animales en la calle generan conflictos entre vecinos por ruido, basura regada o mordeduras, y le dan más carga de trabajo a los servicios municipales.</w:t>
+        <w:t xml:space="preserve">Todo esto termina afectando a la comunidad entera. Los animales en la calle pueden transmitir a las personas enfermedades como la sarna, algunos parásitos intestinales o la leptospirosis, que se conocen como enfermedades zoonóticas. Con la rabia, México logró en 2019 que la Organización Mundial de la Salud reconociera la eliminación de la rabia humana transmitida por perros, pero mantener ese logro exige seguir vacunando y controlando la población animal. Aparte del tema de salud, hay pleitos entre vecinos por el ruido, la basura regada o las mordeduras, y los servicios municipales cargan con más trabajo.</w:t>
       </w:r>
     </w:p>
     <w:p>
@@ -8894,7 +8894,7 @@
           <w:sz w:val="24"/>
           <w:szCs w:val="24"/>
         </w:rPr>
-        <w:t xml:space="preserve">En el aspecto legal ha habido avances. El 4 de febrero de 2025 el Congreso de Nuevo León aprobó una reforma que reconoce el bienestar y el cuidado animal como un derecho, y que establece que la responsabilidad es compartida entre el gobierno y la sociedad (H. Congreso del Estado de N.L., 2025) [agregar fuente]. Es un paso importante, porque deja claro que cuidar a los animales no es solo tarea de las asociaciones civiles. Sin embargo, todavía no se refleja en acciones concretas: como se mencionó antes, casi la mitad de los municipios del estado no cuenta con un centro de atención animal en operación.</w:t>
+        <w:t xml:space="preserve">En lo legal sí ha habido avances. El 4 de febrero de 2025 el Congreso de Nuevo León aprobó una reforma que reconoce el bienestar y el cuidado animal como un derecho, y que deja la responsabilidad compartida entre el gobierno y la sociedad (H. Congreso del Estado de N.L., 2025) [agregar fuente]. Es un paso importante porque deja claro que cuidar a los animales también le toca al gobierno y no solo a las asociaciones civiles. El problema es que todavía no se ve en acciones concretas: como se mencionó en los antecedentes, casi la mitad de los municipios del estado no tiene un centro de atención animal en operación.</w:t>
       </w:r>
     </w:p>
     <w:p>
@@ -8913,7 +8913,7 @@
           <w:sz w:val="24"/>
           <w:szCs w:val="24"/>
         </w:rPr>
-        <w:t xml:space="preserve">Cuando un animal vive en la calle, los problemas se van sumando. Se reproducen sin control, hay riesgos para la salud, los albergues que existen se saturan y la imagen de la ciudad se deteriora. Por eso la solución no puede limitarse a recoger animales y mantenerlos encerrados. Hacen falta espacios que ayuden a que la gente conviva con ellos de forma responsable, que eduquen a la comunidad sobre la importancia de esterilizar y vacunar, y que permitan que los animales encuentren un nuevo hogar.</w:t>
+        <w:t xml:space="preserve">Cuando un animal vive en la calle, los problemas se van acumulando. Se reproduce sin control, hay riesgos para la salud, los albergues que existen se saturan y la imagen de la ciudad se deteriora. Recoger animales y dejarlos encerrados no resuelve nada de esto. Lo que se necesita son espacios que enseñen a la gente a convivir con ellos de forma responsable, que hablen con la comunidad sobre esterilizar y vacunar, y que ayuden a que los animales encuentren un nuevo hogar.</w:t>
       </w:r>
     </w:p>
     <w:p>
@@ -8971,7 +8971,7 @@
           <w:sz w:val="24"/>
           <w:szCs w:val="24"/>
         </w:rPr>
-        <w:t xml:space="preserve">El segundo problema es la falta de infraestructura, es decir, de edificios y espacios preparados para atender a los animales. La Ley de Protección y Bienestar Animal para la Sustentabilidad del Estado de Nuevo León, en sus artículos 66 y 70, pide que los municipios tengan centros de "Atención, Protección y Bienestar Animal" que ofrezcan adopción, esterilización, vacunación y atención veterinaria. Sin embargo, esto no se cumple de la misma manera en todo el estado.</w:t>
+        <w:t xml:space="preserve">El segundo problema es que faltan edificios y espacios preparados para atender a los animales. La Ley de Protección y Bienestar Animal para la Sustentabilidad del Estado de Nuevo León, en sus artículos 66 y 70, pide que los municipios tengan centros de "Atención, Protección y Bienestar Animal" que ofrezcan adopción, esterilización, vacunación y atención veterinaria. En la realidad, esto no se cumple igual en todo el estado.</w:t>
       </w:r>
     </w:p>
     <w:p>
@@ -8990,7 +8990,7 @@
           <w:sz w:val="24"/>
           <w:szCs w:val="24"/>
         </w:rPr>
-        <w:t xml:space="preserve">Varios informes oficiales y notas periodísticas han mostrado que muchos centros municipales trabajan en malas condiciones. Tienen poco personal y pocos recursos, no llevan un registro confiable de los animales que entran y salen, y sus instalaciones no cumplen con las condiciones sanitarias ni con un diseño adecuado. Un ejemplo es el albergue municipal de Santa Catarina, que en 2025 fue intervenido por autoridades estatales después de que se documentaron varias irregularidades en el cuidado de los animales [agregar fuente].</w:t>
+        <w:t xml:space="preserve">Informes oficiales y notas periodísticas han documentado que muchos centros municipales trabajan en malas condiciones. Tienen poco personal y pocos recursos, no llevan un registro confiable de los animales que entran y salen, y sus instalaciones no cumplen con las condiciones sanitarias ni con un diseño adecuado. Un ejemplo es el albergue municipal de Santa Catarina, que en 2025 fue intervenido por autoridades estatales después de que se documentaron varias irregularidades en el cuidado de los animales [agregar fuente].</w:t>
       </w:r>
     </w:p>
     <w:p>
@@ -9009,7 +9009,7 @@
           <w:sz w:val="24"/>
           <w:szCs w:val="24"/>
         </w:rPr>
-        <w:t xml:space="preserve">Desde el punto de vista arquitectónico, muchos de estos lugares se construyeron pensando solo en encerrar a los animales. Es común encontrar jaulas pegadas unas a otras, pisos que no drenan bien, poca ventilación y techos de lámina que en verano se calientan demasiado. En una ciudad como Monterrey, donde en verano las temperaturas pueden pasar los 35 °C, un espacio así puede ser peligroso para un animal. También es común que no exista una separación clara entre los animales enfermos y los sanos, lo que facilita que las enfermedades se contagien dentro del mismo refugio.</w:t>
+        <w:t xml:space="preserve">En cuanto a la arquitectura, muchos de estos lugares se hicieron pensando únicamente en encerrar a los animales. Es común ver jaulas pegadas unas con otras, pisos donde el agua no escurre bien, poca ventilación y techos de lámina que en verano se calientan muchísimo. En Monterrey, donde en verano la temperatura puede pasar de los 35 °C, un espacio así llega a ser peligroso para un animal. Tampoco suele haber una separación clara entre animales enfermos y sanos, y eso facilita que las enfermedades se contagien dentro del mismo refugio.</w:t>
       </w:r>
     </w:p>
     <w:p>
@@ -9028,7 +9028,7 @@
           <w:sz w:val="24"/>
           <w:szCs w:val="24"/>
         </w:rPr>
-        <w:t xml:space="preserve">Otro punto importante es que estos espacios casi nunca están pensados para recibir visitantes. No tienen áreas donde una familia pueda conocer con calma al animal que quiere adoptar, ni espacios para dar pláticas o talleres. Esto hace que la experiencia de ir a un refugio sea incómoda o triste, y que muchas personas prefieran comprar un animal en lugar de adoptar.</w:t>
+        <w:t xml:space="preserve">Otro detalle importante es que casi ninguno de estos espacios está pensado para recibir visitas. No hay un área donde una familia pueda conocer con calma al animal que quiere adoptar, ni un salón para dar pláticas o talleres. Ir a un refugio termina siendo una experiencia incómoda o triste, y mucha gente prefiere comprar un animal antes que adoptar uno. Esto también afecta al personal. Cuidadores y veterinarios pasan jornadas largas en lugares calurosos, con mucho ruido y sin un área para descansar, lo que hace más pesado un trabajo que de por sí es difícil en lo emocional.</w:t>
       </w:r>
     </w:p>
     <w:p>
@@ -9047,7 +9047,7 @@
           <w:sz w:val="24"/>
           <w:szCs w:val="24"/>
         </w:rPr>
-        <w:t xml:space="preserve">Mientras la ley pide una cosa y los municipios no tienen la capacidad de cumplirla, el problema se repite como un círculo: hay más animales en la calle, el gobierno puede atender menos casos y las condiciones de la ciudad empeoran. Por eso este proyecto considera que la falta de infraestructura no se resuelve solo construyendo más jaulas, sino diseñando espacios que realmente funcionen para los animales, para el personal que los cuida y para las personas que los visitan.</w:t>
+        <w:t xml:space="preserve">Mientras la ley pide una cosa y los municipios no tienen con qué cumplirla, el problema se repite una y otra vez: hay más animales en la calle, el gobierno atiende menos casos y las condiciones de la ciudad empeoran. Construir más jaulas no lo resuelve. Hacen falta espacios diseñados para que funcionen bien para los animales, para el personal que los cuida y para las personas que llegan de visita.</w:t>
       </w:r>
     </w:p>
     <w:p>
@@ -9105,7 +9105,7 @@
           <w:sz w:val="24"/>
           <w:szCs w:val="24"/>
         </w:rPr>
-        <w:t xml:space="preserve">El tercer problema tiene que ver con la forma en que se diseñan y se administran los refugios. En la mayoría de las ciudades funcionan solamente como lugares de rescate o albergue, y no se aprovechan como espacios donde la comunidad pueda convivir, aprender o realizar actividades culturales y turísticas. Por eso generan pocos ingresos propios, tienen poca relación con la gente y casi no hacen labor educativa para promover la adopción responsable.</w:t>
+        <w:t xml:space="preserve">El tercer problema está en la forma en que se diseñan y se administran los refugios. En la mayoría de las ciudades funcionan solo como lugares de rescate o albergue, y nadie los aprovecha como espacios donde la comunidad pueda convivir, aprender o hacer actividades culturales y turísticas. Como consecuencia, generan pocos ingresos propios, tienen poca relación con la gente y casi no hacen trabajo educativo para promover la adopción responsable.</w:t>
       </w:r>
     </w:p>
     <w:p>
@@ -9124,7 +9124,7 @@
           <w:sz w:val="24"/>
           <w:szCs w:val="24"/>
         </w:rPr>
-        <w:t xml:space="preserve">Para entender mejor la idea de un modelo híbrido, se puede pensar en un museo que además tiene cafetería, tienda y talleres. La función principal del museo es exhibir, pero las otras actividades atraen a más visitantes y generan dinero para mantenerlo. En este proyecto la función principal sería cuidar y rehabilitar a los animales, y las actividades culturales, educativas y turísticas ayudarían a que el lugar sea conocido, visitado y sostenible. A esto se refiere el término autosustentable: que el proyecto pueda generar buena parte de los recursos que necesita para funcionar.</w:t>
+        <w:t xml:space="preserve">Para explicar mejor qué es un modelo híbrido, se puede pensar en un museo que además tiene cafetería, tienda y talleres. Lo principal del museo es exhibir, pero lo demás atrae a más visitantes y deja dinero para mantenerlo. En este proyecto lo principal sería cuidar y rehabilitar a los animales, y las actividades culturales, educativas y turísticas harían que el lugar se conozca, se visite y pueda sostenerse. Eso es lo que significa autosustentable en este caso: que el proyecto genere buena parte de los recursos que necesita para funcionar.</w:t>
       </w:r>
     </w:p>
     <w:p>
@@ -9143,7 +9143,7 @@
           <w:sz w:val="24"/>
           <w:szCs w:val="24"/>
         </w:rPr>
-        <w:t xml:space="preserve">En otros países ya existen ejemplos que siguen esta idea. En Turquía, el Pako Street Animal Social Life Campus, diseñado por Mert Uslu Architecture, combina clínica veterinaria, zonas de adopción y espacios de socialización para la comunidad. En Estados Unidos, el Michigan Animal Rescue League, en Pontiac, fue diseñado por el despacho PLY+ con espacios abiertos y visuales entre las áreas de los animales y las del público, para que la adopción sea más cercana. Estos casos se analizan con más detalle en el capítulo 5, pero sirven desde ahora para mostrar que un refugio puede ser mucho más que un lugar de encierro.</w:t>
+        <w:t xml:space="preserve">Fuera de México ya hay ejemplos que siguen esta idea. En Turquía, el Pako Street Animal Social Life Campus, diseñado por Mert Uslu Architecture, reúne una clínica veterinaria, zonas de adopción y espacios de socialización para la comunidad. En Pontiac, Estados Unidos, el Michigan Animal Rescue League fue diseñado por el despacho PLY+ con espacios abiertos y vistas entre las áreas de los animales y las del público, para que la adopción se sienta más cercana. Los dos casos se analizan con detalle en el capítulo 5; por ahora sirven para mostrar que un refugio puede ser mucho más que un lugar de encierro.</w:t>
       </w:r>
     </w:p>
     <w:p>
@@ -9162,7 +9162,7 @@
           <w:sz w:val="24"/>
           <w:szCs w:val="24"/>
         </w:rPr>
-        <w:t xml:space="preserve">En México, en cambio, este tipo de modelos todavía es poco común. Por eso este proyecto propone un refugio híbrido que combine bienestar animal, turismo cultural, educación ambiental y criterios de sustentabilidad en el diseño. La tipología que mejor se ajusta a esta idea es la de un Centro de Bienestar Animal y Cultural con enfoque turístico. La propuesta también se apoya en el enfoque conocido como animal-aided design, que en términos sencillos es diseñar tomando en cuenta también a los animales, y que plantea que los espacios hechos para las personas deben integrar la vida animal como parte de lo construido (Tüzen y Aycı, 2023).</w:t>
+        <w:t xml:space="preserve">En México este tipo de modelo todavía es poco común. Lo más parecido son algunos cafés con perros o gatos en adopción que han abierto en distintas ciudades, pero son negocios pequeños y no funcionan como un equipamiento público con atención veterinaria, educación y áreas abiertas. Este proyecto propone un refugio híbrido que combine bienestar animal, turismo cultural, educación ambiental y criterios de sustentabilidad en el diseño, y la tipología que mejor se ajusta a la idea es la de un Centro de Bienestar Animal y Cultural con enfoque turístico. La propuesta se apoya también en el enfoque conocido como animal-aided design, que en palabras sencillas es diseñar tomando en cuenta a los animales, y que plantea que los espacios hechos para las personas deben integrar la vida animal como parte de lo construido (Tüzen y Aycı, 2023).</w:t>
       </w:r>
     </w:p>
     <w:p>
@@ -9181,7 +9181,7 @@
           <w:sz w:val="24"/>
           <w:szCs w:val="24"/>
         </w:rPr>
-        <w:t xml:space="preserve">Desde este punto de vista, la arquitectura deja de ser solo un lugar para guardar animales y se convierte en un espacio que ayuda a que personas y animales convivan mejor. Además, un proyecto así puede reforzar la identidad de la zona donde se ubica, porque se vuelve un punto de encuentro para las familias y un lugar reconocido dentro del municipio.</w:t>
+        <w:t xml:space="preserve">Visto así, el edificio tiene un papel más amplio que guardar animales: ayuda a que personas y animales convivan mejor. Un proyecto de este tipo también puede darle identidad a la zona donde se ubica, porque se vuelve un punto de reunión para las familias y un lugar conocido dentro del municipio.</w:t>
       </w:r>
     </w:p>
     <w:p>
@@ -9200,7 +9200,7 @@
           <w:sz w:val="24"/>
           <w:szCs w:val="24"/>
         </w:rPr>
-        <w:t xml:space="preserve">Por lo tanto, el reto de este proyecto va más allá de hacer instalaciones para alojar animales abandonados. También se necesitan espacios donde puedan rehabilitarse, donde se realicen actividades culturales y turísticas responsables, y un modelo económico que permita que el centro siga funcionando a largo plazo, sin depender por completo de las donaciones.</w:t>
+        <w:t xml:space="preserve">El reto del proyecto, entonces, es más grande que hacer instalaciones para alojar animales abandonados. Se necesitan espacios donde puedan rehabilitarse, lugares para actividades culturales y turísticas responsables, y un modelo económico que permita que el centro siga funcionando a largo plazo sin depender por completo de las donaciones.</w:t>
       </w:r>
     </w:p>
     <w:p>
@@ -9258,7 +9258,7 @@
           <w:sz w:val="24"/>
           <w:szCs w:val="24"/>
         </w:rPr>
-        <w:t xml:space="preserve">Los objetivos son las metas que se quieren alcanzar con esta investigación. Se dividen en un objetivo general, que resume el propósito principal del proyecto, y en objetivos específicos, que son los pasos concretos para llegar a él.</w:t>
+        <w:t xml:space="preserve">Los objetivos marcan lo que se quiere lograr con la investigación. Hay un objetivo general, que resume el propósito principal, y varios objetivos específicos, que son los pasos concretos para llegar a él. Se redactaron de forma que cada uno se pueda revisar al final del trabajo, para saber si de verdad se cumplió.</w:t>
       </w:r>
     </w:p>
     <w:p>
@@ -9367,7 +9367,7 @@
           <w:sz w:val="24"/>
           <w:szCs w:val="24"/>
         </w:rPr>
-        <w:t xml:space="preserve">2. Establecer los criterios funcionales, estéticos y tecnológicos del proyecto, para que los animales tengan buenas condiciones de vida y los visitantes tengan una experiencia agradable y educativa gracias a las actividades culturales y turísticas.</w:t>
+        <w:t xml:space="preserve">2. Establecer los criterios funcionales, estéticos y tecnológicos del proyecto, de modo que los animales tengan buenas condiciones de vida y los visitantes vivan una experiencia agradable y educativa a través de las actividades culturales y turísticas.</w:t>
       </w:r>
     </w:p>
     <w:p>
@@ -9387,7 +9387,7 @@
           <w:sz w:val="24"/>
           <w:szCs w:val="24"/>
         </w:rPr>
-        <w:t xml:space="preserve">3. Proponer un programa arquitectónico que incluya zonas de bienestar animal, espacios culturales y turísticos, áreas de convivencia entre personas y animales, y espacios que generen ingresos para el refugio.</w:t>
+        <w:t xml:space="preserve">3. Proponer un programa arquitectónico con zonas de bienestar animal, espacios culturales y turísticos, áreas de convivencia entre personas y animales, y espacios que generen ingresos para el refugio.</w:t>
       </w:r>
     </w:p>
     <w:p>
@@ -9407,7 +9407,7 @@
           <w:sz w:val="24"/>
           <w:szCs w:val="24"/>
         </w:rPr>
-        <w:t xml:space="preserve">4. Evaluar sistemas constructivos, materiales sustentables y tecnologías que ayuden a ahorrar energía y agua, reduzcan el impacto ambiental y se adapten al clima del área metropolitana de Monterrey.</w:t>
+        <w:t xml:space="preserve">4. Evaluar sistemas constructivos, materiales sustentables y tecnologías que permitan ahorrar energía y agua, reduzcan el impacto ambiental y se adapten al clima del área metropolitana de Monterrey.</w:t>
       </w:r>
     </w:p>
     <w:p>
@@ -9427,7 +9427,7 @@
           <w:sz w:val="24"/>
           <w:szCs w:val="24"/>
         </w:rPr>
-        <w:t xml:space="preserve">5. Diseñar un modelo de operación que combine ingresos por turismo, talleres de educación ambiental, adopciones y comercio local, para que el refugio pueda mantenerse con recursos propios y depender lo menos posible de subsidios o donaciones.</w:t>
+        <w:t xml:space="preserve">5. Diseñar un modelo de operación que combine ingresos por turismo, talleres de educación ambiental, adopciones y comercio local, para que el refugio pueda mantenerse con recursos propios y dependa lo menos posible de subsidios o donaciones.</w:t>
       </w:r>
     </w:p>
     <w:p>
@@ -9446,8 +9446,22 @@
           <w:sz w:val="24"/>
           <w:szCs w:val="24"/>
         </w:rPr>
-        <w:t xml:space="preserve">Cada uno de estos objetivos se desarrolla en los siguientes capítulos de la tesis. El análisis del contexto se trabaja en los capítulos 2 y 3, donde se estudian el municipio, el terreno y su entorno. Los criterios de diseño y el programa arquitectónico se presentan en los capítulos 5 y 6, apoyados en el marco teórico del capítulo 4 y en el estudio de casos análogos. Finalmente, la parte económica y las estrategias de sustentabilidad se retoman en el marco económico y en los criterios tecnológicos del proyecto.</w:t>
-      </w:r>
+        <w:t xml:space="preserve">Estos objetivos se van trabajando a lo largo de la tesis. El análisis del contexto está en los capítulos 2 y 3, donde se estudian el municipio, el terreno y su entorno. Los criterios de diseño y el programa arquitectónico se presentan en los capítulos 5 y 6, con base en el marco teórico del capítulo 4 y en el estudio de casos análogos. La parte económica y las estrategias de sustentabilidad se retoman en el marco económico y en los criterios tecnológicos del proyecto. Así se puede seguir el hilo de la investigación de principio a fin.</w:t>
+      </w:r>
+    </w:p>
+    <w:p>
+      <w:pPr>
+        <w:spacing w:line="360" w:lineRule="auto"/>
+        <w:jc w:val="left"/>
+        <w:rPr>
+          <w:rFonts w:ascii="Arial" w:hAnsi="Arial" w:cs="Arial"/>
+          <w:b/>
+          <w:bCs/>
+          <w:sz w:val="24"/>
+          <w:szCs w:val="24"/>
+          <w:lang w:val="en-MX"/>
+        </w:rPr>
+      </w:pPr>
     </w:p>
     <w:sectPr>
       <w:type w:val="continuous"/>

</xml_diff>